<commit_message>
docs: Add graphics and trophic network to case study document
- Created new trophic network visualization showing 24-group food web
- Added 5 figures to case study document:
  * Trophic network structure (newly generated)
  * Ecosim scenario results (4 management strategies)
  * Environmental forcing time series (temperature & productivity)
  * Spatial ecospace dynamics (5 habitat patches)
  * Multi-stanza growth analysis (Von Bertalanffy parameters)
- Document now includes comprehensive visual analysis
- Increased document size from 43 KB to 1.99 MB with embedded graphics

Co-authored-by: Copilot <223556219+Copilot@users.noreply.github.com>
</commit_message>
<xml_diff>
--- a/Curonian_Lagoon_Case_Study.docx
+++ b/Curonian_Lagoon_Case_Study.docx
@@ -2944,6 +2944,348 @@
       </w:r>
     </w:p>
     <w:p/>
+    <w:p>
+      <w:r>
+        <w:br w:type="page"/>
+      </w:r>
+    </w:p>
+    <w:p>
+      <w:pPr>
+        <w:pStyle w:val="Heading1"/>
+      </w:pPr>
+      <w:r>
+        <w:t>9. Figures and Graphics</w:t>
+      </w:r>
+    </w:p>
+    <w:p>
+      <w:pPr>
+        <w:pStyle w:val="Heading2"/>
+      </w:pPr>
+      <w:r>
+        <w:t>9.1 Trophic Network Structure</w:t>
+      </w:r>
+    </w:p>
+    <w:p>
+      <w:r>
+        <w:t>Figure 1 shows the food web structure of the Curonian Lagoon model. Colors indicate trophic level (red: apex predators; crimson: piscivores; blue: planktivores; purple: zoobenthos; green: producers). Arrows indicate energy flow from prey to predator. The network comprises 24 functional groups across 4 major trophic levels, with complex omnivory (Omnivory Index = 0.243).</w:t>
+      </w:r>
+    </w:p>
+    <w:p>
+      <w:pPr>
+        <w:jc w:val="center"/>
+      </w:pPr>
+      <w:r>
+        <w:drawing>
+          <wp:inline xmlns:a="http://schemas.openxmlformats.org/drawingml/2006/main" xmlns:pic="http://schemas.openxmlformats.org/drawingml/2006/picture">
+            <wp:extent cx="5943600" cy="4211832"/>
+            <wp:docPr id="1" name="Picture 1"/>
+            <wp:cNvGraphicFramePr>
+              <a:graphicFrameLocks noChangeAspect="1"/>
+            </wp:cNvGraphicFramePr>
+            <a:graphic>
+              <a:graphicData uri="http://schemas.openxmlformats.org/drawingml/2006/picture">
+                <pic:pic>
+                  <pic:nvPicPr>
+                    <pic:cNvPr id="0" name="curonian_trophic_network.png"/>
+                    <pic:cNvPicPr/>
+                  </pic:nvPicPr>
+                  <pic:blipFill>
+                    <a:blip r:embed="rId10"/>
+                    <a:stretch>
+                      <a:fillRect/>
+                    </a:stretch>
+                  </pic:blipFill>
+                  <pic:spPr>
+                    <a:xfrm>
+                      <a:off x="0" y="0"/>
+                      <a:ext cx="5943600" cy="4211832"/>
+                    </a:xfrm>
+                    <a:prstGeom prst="rect"/>
+                  </pic:spPr>
+                </pic:pic>
+              </a:graphicData>
+            </a:graphic>
+          </wp:inline>
+        </w:drawing>
+      </w:r>
+    </w:p>
+    <w:p>
+      <w:pPr>
+        <w:jc w:val="center"/>
+      </w:pPr>
+      <w:r>
+        <w:rPr>
+          <w:i/>
+          <w:sz w:val="20"/>
+        </w:rPr>
+        <w:t>Figure 1: Trophic network structure showing food web connectivity and trophic levels</w:t>
+      </w:r>
+    </w:p>
+    <w:p/>
+    <w:p>
+      <w:pPr>
+        <w:pStyle w:val="Heading2"/>
+      </w:pPr>
+      <w:r>
+        <w:t>9.2 Ecosim Scenario Results</w:t>
+      </w:r>
+    </w:p>
+    <w:p>
+      <w:r>
+        <w:t>Figure 2 presents results from four 20-year Ecosim simulations under different fisheries scenarios: baseline (no change), reduce fishing 50%, complete closure, and increase fishing 30%. Results show biomass trajectories for major functional groups across the simulation horizon. The reduction scenario yields 18.5% average biomass increase, while closure yields 35.2% recovery.</w:t>
+      </w:r>
+    </w:p>
+    <w:p>
+      <w:pPr>
+        <w:jc w:val="center"/>
+      </w:pPr>
+      <w:r>
+        <w:drawing>
+          <wp:inline xmlns:a="http://schemas.openxmlformats.org/drawingml/2006/main" xmlns:pic="http://schemas.openxmlformats.org/drawingml/2006/picture">
+            <wp:extent cx="5943600" cy="4415923"/>
+            <wp:docPr id="2" name="Picture 2"/>
+            <wp:cNvGraphicFramePr>
+              <a:graphicFrameLocks noChangeAspect="1"/>
+            </wp:cNvGraphicFramePr>
+            <a:graphic>
+              <a:graphicData uri="http://schemas.openxmlformats.org/drawingml/2006/picture">
+                <pic:pic>
+                  <pic:nvPicPr>
+                    <pic:cNvPr id="0" name="multistanza_ecosim_scenarios.png"/>
+                    <pic:cNvPicPr/>
+                  </pic:nvPicPr>
+                  <pic:blipFill>
+                    <a:blip r:embed="rId11"/>
+                    <a:stretch>
+                      <a:fillRect/>
+                    </a:stretch>
+                  </pic:blipFill>
+                  <pic:spPr>
+                    <a:xfrm>
+                      <a:off x="0" y="0"/>
+                      <a:ext cx="5943600" cy="4415923"/>
+                    </a:xfrm>
+                    <a:prstGeom prst="rect"/>
+                  </pic:spPr>
+                </pic:pic>
+              </a:graphicData>
+            </a:graphic>
+          </wp:inline>
+        </w:drawing>
+      </w:r>
+    </w:p>
+    <w:p>
+      <w:pPr>
+        <w:jc w:val="center"/>
+      </w:pPr>
+      <w:r>
+        <w:rPr>
+          <w:i/>
+          <w:sz w:val="20"/>
+        </w:rPr>
+        <w:t>Figure 2: Biomass dynamics under four management scenarios over 20 years</w:t>
+      </w:r>
+    </w:p>
+    <w:p/>
+    <w:p>
+      <w:pPr>
+        <w:pStyle w:val="Heading2"/>
+      </w:pPr>
+      <w:r>
+        <w:t>9.3 Environmental Forcing Time Series</w:t>
+      </w:r>
+    </w:p>
+    <w:p>
+      <w:r>
+        <w:t>Figure 3 shows temperature and productivity forcing functions applied to the model. Temperature varies seasonally (8-25°C) with inter-annual variability. Productivity shows spring bloom pattern (0.1-1.0 normalized). Combined forcing drives recruitment success and juvenile natural mortality rates.</w:t>
+      </w:r>
+    </w:p>
+    <w:p>
+      <w:pPr>
+        <w:jc w:val="center"/>
+      </w:pPr>
+      <w:r>
+        <w:drawing>
+          <wp:inline xmlns:a="http://schemas.openxmlformats.org/drawingml/2006/main" xmlns:pic="http://schemas.openxmlformats.org/drawingml/2006/picture">
+            <wp:extent cx="5943600" cy="4426865"/>
+            <wp:docPr id="3" name="Picture 3"/>
+            <wp:cNvGraphicFramePr>
+              <a:graphicFrameLocks noChangeAspect="1"/>
+            </wp:cNvGraphicFramePr>
+            <a:graphic>
+              <a:graphicData uri="http://schemas.openxmlformats.org/drawingml/2006/picture">
+                <pic:pic>
+                  <pic:nvPicPr>
+                    <pic:cNvPr id="0" name="environmental_forcing.png"/>
+                    <pic:cNvPicPr/>
+                  </pic:nvPicPr>
+                  <pic:blipFill>
+                    <a:blip r:embed="rId12"/>
+                    <a:stretch>
+                      <a:fillRect/>
+                    </a:stretch>
+                  </pic:blipFill>
+                  <pic:spPr>
+                    <a:xfrm>
+                      <a:off x="0" y="0"/>
+                      <a:ext cx="5943600" cy="4426865"/>
+                    </a:xfrm>
+                    <a:prstGeom prst="rect"/>
+                  </pic:spPr>
+                </pic:pic>
+              </a:graphicData>
+            </a:graphic>
+          </wp:inline>
+        </w:drawing>
+      </w:r>
+    </w:p>
+    <w:p>
+      <w:pPr>
+        <w:jc w:val="center"/>
+      </w:pPr>
+      <w:r>
+        <w:rPr>
+          <w:i/>
+          <w:sz w:val="20"/>
+        </w:rPr>
+        <w:t>Figure 3: Temperature and productivity forcing functions (20-year timeseries)</w:t>
+      </w:r>
+    </w:p>
+    <w:p/>
+    <w:p>
+      <w:pPr>
+        <w:pStyle w:val="Heading2"/>
+      </w:pPr>
+      <w:r>
+        <w:t>9.4 Spatial Ecospace Dynamics</w:t>
+      </w:r>
+    </w:p>
+    <w:p>
+      <w:r>
+        <w:t>Figure 4 depicts spatial distribution patterns across five habitat patches. Colors represent biomass density. Littoral zones show high juvenile abundance (0-2 m depth), while profundal zones (7-9.5 m) host predominantly adult populations. Ontogenetic migration patterns are evident in the seasonal shift of biomass distribution.</w:t>
+      </w:r>
+    </w:p>
+    <w:p>
+      <w:pPr>
+        <w:jc w:val="center"/>
+      </w:pPr>
+      <w:r>
+        <w:drawing>
+          <wp:inline xmlns:a="http://schemas.openxmlformats.org/drawingml/2006/main" xmlns:pic="http://schemas.openxmlformats.org/drawingml/2006/picture">
+            <wp:extent cx="5943600" cy="3143480"/>
+            <wp:docPr id="4" name="Picture 4"/>
+            <wp:cNvGraphicFramePr>
+              <a:graphicFrameLocks noChangeAspect="1"/>
+            </wp:cNvGraphicFramePr>
+            <a:graphic>
+              <a:graphicData uri="http://schemas.openxmlformats.org/drawingml/2006/picture">
+                <pic:pic>
+                  <pic:nvPicPr>
+                    <pic:cNvPr id="0" name="ecospace_spatial_dynamics.png"/>
+                    <pic:cNvPicPr/>
+                  </pic:nvPicPr>
+                  <pic:blipFill>
+                    <a:blip r:embed="rId13"/>
+                    <a:stretch>
+                      <a:fillRect/>
+                    </a:stretch>
+                  </pic:blipFill>
+                  <pic:spPr>
+                    <a:xfrm>
+                      <a:off x="0" y="0"/>
+                      <a:ext cx="5943600" cy="3143480"/>
+                    </a:xfrm>
+                    <a:prstGeom prst="rect"/>
+                  </pic:spPr>
+                </pic:pic>
+              </a:graphicData>
+            </a:graphic>
+          </wp:inline>
+        </w:drawing>
+      </w:r>
+    </w:p>
+    <w:p>
+      <w:pPr>
+        <w:jc w:val="center"/>
+      </w:pPr>
+      <w:r>
+        <w:rPr>
+          <w:i/>
+          <w:sz w:val="20"/>
+        </w:rPr>
+        <w:t>Figure 4: Spatial biomass distribution across five habitat patches</w:t>
+      </w:r>
+    </w:p>
+    <w:p/>
+    <w:p>
+      <w:pPr>
+        <w:pStyle w:val="Heading2"/>
+      </w:pPr>
+      <w:r>
+        <w:t>9.5 Multi-Stanza Growth Analysis</w:t>
+      </w:r>
+    </w:p>
+    <w:p>
+      <w:r>
+        <w:t>Figure 5 compares growth and mortality characteristics of multi-stanza groups. Von Bertalanffy K parameters vary from 0.12 yr-1 (slow-growing predatory fish) to 0.80 yr-1 (fast-growing planktivorous fish). Natural mortality (Z) is higher for juveniles (1.2-1.8 yr-1) than adults (0.3-0.8 yr-1) due to size-selective predation.</w:t>
+      </w:r>
+    </w:p>
+    <w:p>
+      <w:pPr>
+        <w:jc w:val="center"/>
+      </w:pPr>
+      <w:r>
+        <w:drawing>
+          <wp:inline xmlns:a="http://schemas.openxmlformats.org/drawingml/2006/main" xmlns:pic="http://schemas.openxmlformats.org/drawingml/2006/picture">
+            <wp:extent cx="5943600" cy="4431836"/>
+            <wp:docPr id="5" name="Picture 5"/>
+            <wp:cNvGraphicFramePr>
+              <a:graphicFrameLocks noChangeAspect="1"/>
+            </wp:cNvGraphicFramePr>
+            <a:graphic>
+              <a:graphicData uri="http://schemas.openxmlformats.org/drawingml/2006/picture">
+                <pic:pic>
+                  <pic:nvPicPr>
+                    <pic:cNvPr id="0" name="extended_stanzas_analysis.png"/>
+                    <pic:cNvPicPr/>
+                  </pic:nvPicPr>
+                  <pic:blipFill>
+                    <a:blip r:embed="rId14"/>
+                    <a:stretch>
+                      <a:fillRect/>
+                    </a:stretch>
+                  </pic:blipFill>
+                  <pic:spPr>
+                    <a:xfrm>
+                      <a:off x="0" y="0"/>
+                      <a:ext cx="5943600" cy="4431836"/>
+                    </a:xfrm>
+                    <a:prstGeom prst="rect"/>
+                  </pic:spPr>
+                </pic:pic>
+              </a:graphicData>
+            </a:graphic>
+          </wp:inline>
+        </w:drawing>
+      </w:r>
+    </w:p>
+    <w:p>
+      <w:pPr>
+        <w:jc w:val="center"/>
+      </w:pPr>
+      <w:r>
+        <w:rPr>
+          <w:i/>
+          <w:sz w:val="20"/>
+        </w:rPr>
+        <w:t>Figure 5: Von Bertalanffy growth and natural mortality parameters by stanza</w:t>
+      </w:r>
+    </w:p>
+    <w:p>
+      <w:r>
+        <w:br w:type="page"/>
+      </w:r>
+    </w:p>
     <w:sectPr>
       <w:footerReference w:type="default" r:id="rId9"/>
       <w:pgSz w:w="12240" w:h="15840"/>

</xml_diff>